<commit_message>
checkpoint: full workspace before authorization cleanup
</commit_message>
<xml_diff>
--- a/HireHuub Hirerchy.docx
+++ b/HireHuub Hirerchy.docx
@@ -1,13 +1,11 @@
 
 <file path=word/document.xml><?xml version="1.0" encoding="utf-8"?>
-<w:document xmlns:wpc="http://schemas.microsoft.com/office/word/2010/wordprocessingCanvas" xmlns:cx="http://schemas.microsoft.com/office/drawing/2014/chartex" xmlns:cx1="http://schemas.microsoft.com/office/drawing/2015/9/8/chartex" xmlns:cx2="http://schemas.microsoft.com/office/drawing/2015/10/21/chartex" xmlns:cx3="http://schemas.microsoft.com/office/drawing/2016/5/9/chartex" xmlns:cx4="http://schemas.microsoft.com/office/drawing/2016/5/10/chartex" xmlns:cx5="http://schemas.microsoft.com/office/drawing/2016/5/11/chartex" xmlns:cx6="http://schemas.microsoft.com/office/drawing/2016/5/12/chartex" xmlns:cx7="http://schemas.microsoft.com/office/drawing/2016/5/13/chartex" xmlns:cx8="http://schemas.microsoft.com/office/drawing/2016/5/14/chartex" xmlns:mc="http://schemas.openxmlformats.org/markup-compatibility/2006" xmlns:aink="http://schemas.microsoft.com/office/drawing/2016/ink" xmlns:am3d="http://schemas.microsoft.com/office/drawing/2017/model3d" xmlns:o="urn:schemas-microsoft-com:office:office" xmlns:oel="http://schemas.microsoft.com/office/2019/extlst" xmlns:r="http://schemas.openxmlformats.org/officeDocument/2006/relationships" xmlns:m="http://schemas.openxmlformats.org/officeDocument/2006/math" xmlns:v="urn:schemas-microsoft-com:vml" xmlns:wp14="http://schemas.microsoft.com/office/word/2010/wordprocessingDrawing" xmlns:wp="http://schemas.openxmlformats.org/drawingml/2006/wordprocessingDrawing" xmlns:w10="urn:schemas-microsoft-com:office:word" xmlns:w="http://schemas.openxmlformats.org/wordprocessingml/2006/main" xmlns:w14="http://schemas.microsoft.com/office/word/2010/wordml" xmlns:w15="http://schemas.microsoft.com/office/word/2012/wordml" xmlns:w16cex="http://schemas.microsoft.com/office/word/2018/wordml/cex" xmlns:w16cid="http://schemas.microsoft.com/office/word/2016/wordml/cid" xmlns:w16="http://schemas.microsoft.com/office/word/2018/wordml" xmlns:w16du="http://schemas.microsoft.com/office/word/2023/wordml/word16du" xmlns:w16sdtdh="http://schemas.microsoft.com/office/word/2020/wordml/sdtdatahash" xmlns:w16sdtfl="http://schemas.microsoft.com/office/word/2024/wordml/sdtformatlock" xmlns:w16se="http://schemas.microsoft.com/office/word/2015/wordml/symex" xmlns:wpg="http://schemas.microsoft.com/office/word/2010/wordprocessingGroup" xmlns:wpi="http://schemas.microsoft.com/office/word/2010/wordprocessingInk" xmlns:wne="http://schemas.microsoft.com/office/word/2006/wordml" xmlns:wps="http://schemas.microsoft.com/office/word/2010/wordprocessingShape" mc:Ignorable="w14 w15 w16se w16cid w16 w16cex w16sdtdh w16sdtfl w16du wp14">
+<w:document xmlns:wpc="http://schemas.microsoft.com/office/word/2010/wordprocessingCanvas" xmlns:cx="http://schemas.microsoft.com/office/drawing/2014/chartex" xmlns:cx1="http://schemas.microsoft.com/office/drawing/2015/9/8/chartex" xmlns:cx2="http://schemas.microsoft.com/office/drawing/2015/10/21/chartex" xmlns:cx3="http://schemas.microsoft.com/office/drawing/2016/5/9/chartex" xmlns:cx4="http://schemas.microsoft.com/office/drawing/2016/5/10/chartex" xmlns:cx5="http://schemas.microsoft.com/office/drawing/2016/5/11/chartex" xmlns:cx6="http://schemas.microsoft.com/office/drawing/2016/5/12/chartex" xmlns:cx7="http://schemas.microsoft.com/office/drawing/2016/5/13/chartex" xmlns:cx8="http://schemas.microsoft.com/office/drawing/2016/5/14/chartex" xmlns:mc="http://schemas.openxmlformats.org/markup-compatibility/2006" xmlns:aink="http://schemas.microsoft.com/office/drawing/2016/ink" xmlns:am3d="http://schemas.microsoft.com/office/drawing/2017/model3d" xmlns:o="urn:schemas-microsoft-com:office:office" xmlns:oel="http://schemas.microsoft.com/office/2019/extlst" xmlns:r="http://schemas.openxmlformats.org/officeDocument/2006/relationships" xmlns:m="http://schemas.openxmlformats.org/officeDocument/2006/math" xmlns:v="urn:schemas-microsoft-com:vml" xmlns:wp14="http://schemas.microsoft.com/office/word/2010/wordprocessingDrawing" xmlns:wp="http://schemas.openxmlformats.org/drawingml/2006/wordprocessingDrawing" xmlns:w10="urn:schemas-microsoft-com:office:word" xmlns:w="http://schemas.openxmlformats.org/wordprocessingml/2006/main" xmlns:w14="http://schemas.microsoft.com/office/word/2010/wordml" xmlns:w15="http://schemas.microsoft.com/office/word/2012/wordml" xmlns:w16cei="http://schemas.microsoft.com/office/word/2026/wordml/cei" xmlns:w16cex="http://schemas.microsoft.com/office/word/2018/wordml/cex" xmlns:w16cid="http://schemas.microsoft.com/office/word/2016/wordml/cid" xmlns:w16="http://schemas.microsoft.com/office/word/2018/wordml" xmlns:w16du="http://schemas.microsoft.com/office/word/2023/wordml/word16du" xmlns:w16sdtdh="http://schemas.microsoft.com/office/word/2020/wordml/sdtdatahash" xmlns:w16sdtfl="http://schemas.microsoft.com/office/word/2024/wordml/sdtformatlock" xmlns:w16se="http://schemas.microsoft.com/office/word/2015/wordml/symex" xmlns:wpg="http://schemas.microsoft.com/office/word/2010/wordprocessingGroup" xmlns:wpi="http://schemas.microsoft.com/office/word/2010/wordprocessingInk" xmlns:wne="http://schemas.microsoft.com/office/word/2006/wordml" xmlns:wps="http://schemas.microsoft.com/office/word/2010/wordprocessingShape" mc:Ignorable="w14 w15 w16se w16cid w16 w16cex w16sdtdh w16sdtfl w16du wp14">
   <w:body>
     <w:p>
-      <w:proofErr w:type="spellStart"/>
       <w:r>
         <w:t>HireHuub</w:t>
       </w:r>
-      <w:proofErr w:type="spellEnd"/>
     </w:p>
     <w:p/>
     <w:p>
@@ -153,6 +151,9 @@
         <w:t xml:space="preserve">│      </w:t>
       </w:r>
       <w:r>
+        <w:tab/>
+      </w:r>
+      <w:r>
         <w:rPr>
           <w:rFonts w:ascii="MS Gothic" w:eastAsia="MS Gothic" w:hAnsi="MS Gothic" w:cs="MS Gothic" w:hint="eastAsia"/>
         </w:rPr>
@@ -170,9 +171,38 @@
     </w:p>
     <w:p>
       <w:r>
+        <w:t xml:space="preserve">│     </w:t>
+      </w:r>
+      <w:r>
+        <w:tab/>
+      </w:r>
+      <w:r>
+        <w:t xml:space="preserve"> </w:t>
+      </w:r>
+      <w:r>
+        <w:rPr>
+          <w:rFonts w:ascii="MS Gothic" w:eastAsia="MS Gothic" w:hAnsi="MS Gothic" w:cs="MS Gothic" w:hint="eastAsia"/>
+        </w:rPr>
+        <w:t>├</w:t>
+      </w:r>
+      <w:r>
+        <w:rPr>
+          <w:rFonts w:ascii="Aptos" w:hAnsi="Aptos" w:cs="Aptos"/>
+        </w:rPr>
+        <w:t>──</w:t>
+      </w:r>
+      <w:r>
+        <w:t xml:space="preserve"> Business Development Executive</w:t>
+      </w:r>
+    </w:p>
+    <w:p>
+      <w:r>
         <w:t xml:space="preserve">│      </w:t>
       </w:r>
       <w:r>
+        <w:tab/>
+      </w:r>
+      <w:r>
         <w:rPr>
           <w:rFonts w:ascii="MS Gothic" w:eastAsia="MS Gothic" w:hAnsi="MS Gothic" w:cs="MS Gothic" w:hint="eastAsia"/>
         </w:rPr>
@@ -185,12 +215,56 @@
         <w:t>──</w:t>
       </w:r>
       <w:r>
-        <w:t xml:space="preserve"> Business Development Executive</w:t>
-      </w:r>
-    </w:p>
-    <w:p>
-      <w:r>
-        <w:t xml:space="preserve">│      </w:t>
+        <w:t xml:space="preserve"> MIS</w:t>
+      </w:r>
+    </w:p>
+    <w:p>
+      <w:r>
+        <w:t xml:space="preserve">│    </w:t>
+      </w:r>
+      <w:r>
+        <w:tab/>
+      </w:r>
+      <w:r>
+        <w:t xml:space="preserve">  └── Marketing Executive</w:t>
+      </w:r>
+    </w:p>
+    <w:p>
+      <w:r>
+        <w:tab/>
+        <w:t>|--Product Team</w:t>
+      </w:r>
+    </w:p>
+    <w:p>
+      <w:r>
+        <w:tab/>
+        <w:t>|-- Verification Team</w:t>
+      </w:r>
+    </w:p>
+    <w:p>
+      <w:r>
+        <w:tab/>
+        <w:t>|-- IT Team</w:t>
+      </w:r>
+    </w:p>
+    <w:p>
+      <w:r>
+        <w:tab/>
+      </w:r>
+    </w:p>
+    <w:p>
+      <w:r>
+        <w:t>│</w:t>
+      </w:r>
+    </w:p>
+    <w:p>
+      <w:r>
+        <w:t>└── Finance</w:t>
+      </w:r>
+    </w:p>
+    <w:p>
+      <w:r>
+        <w:t xml:space="preserve">       </w:t>
       </w:r>
       <w:r>
         <w:rPr>
@@ -205,22 +279,7 @@
         <w:t>──</w:t>
       </w:r>
       <w:r>
-        <w:t xml:space="preserve"> MIS</w:t>
-      </w:r>
-    </w:p>
-    <w:p>
-      <w:r>
-        <w:t>│      └── Marketing Executive</w:t>
-      </w:r>
-    </w:p>
-    <w:p>
-      <w:r>
-        <w:t>│</w:t>
-      </w:r>
-    </w:p>
-    <w:p>
-      <w:r>
-        <w:t>└── Finance</w:t>
+        <w:t xml:space="preserve"> Finance Manager</w:t>
       </w:r>
     </w:p>
     <w:p>
@@ -240,32 +299,63 @@
         <w:t>──</w:t>
       </w:r>
       <w:r>
-        <w:t xml:space="preserve"> Finance Manager</w:t>
-      </w:r>
-    </w:p>
-    <w:p>
-      <w:r>
-        <w:t xml:space="preserve">       </w:t>
-      </w:r>
-      <w:r>
-        <w:rPr>
-          <w:rFonts w:ascii="MS Gothic" w:eastAsia="MS Gothic" w:hAnsi="MS Gothic" w:cs="MS Gothic" w:hint="eastAsia"/>
-        </w:rPr>
-        <w:t>├</w:t>
-      </w:r>
-      <w:r>
-        <w:rPr>
-          <w:rFonts w:ascii="Aptos" w:hAnsi="Aptos" w:cs="Aptos"/>
-        </w:rPr>
-        <w:t>──</w:t>
-      </w:r>
-      <w:r>
         <w:t xml:space="preserve"> Payroll Executive</w:t>
       </w:r>
     </w:p>
     <w:p>
       <w:r>
         <w:t xml:space="preserve">       └── Accounts Executive</w:t>
+      </w:r>
+    </w:p>
+    <w:p>
+      <w:r>
+        <w:lastRenderedPageBreak/>
+        <w:t>|</w:t>
+      </w:r>
+    </w:p>
+    <w:p>
+      <w:r>
+        <w:t>|_ Sales</w:t>
+      </w:r>
+    </w:p>
+    <w:p>
+      <w:r>
+        <w:tab/>
+        <w:t>|--- Key Account Manager</w:t>
+      </w:r>
+      <w:r>
+        <w:br/>
+      </w:r>
+      <w:r>
+        <w:tab/>
+        <w:t>|-- Sales manager</w:t>
+      </w:r>
+    </w:p>
+    <w:p>
+      <w:r>
+        <w:tab/>
+        <w:t>|-- Regional Manager</w:t>
+      </w:r>
+    </w:p>
+    <w:p>
+      <w:r>
+        <w:tab/>
+        <w:t>|-- National Head</w:t>
+      </w:r>
+    </w:p>
+    <w:p>
+      <w:r>
+        <w:tab/>
+        <w:t>|-- AVP</w:t>
+      </w:r>
+    </w:p>
+    <w:p>
+      <w:r>
+        <w:tab/>
+        <w:t>|-- VP</w:t>
+      </w:r>
+      <w:r>
+        <w:tab/>
       </w:r>
     </w:p>
     <w:sectPr>
@@ -279,7 +369,7 @@
 </file>
 
 <file path=word/numbering.xml><?xml version="1.0" encoding="utf-8"?>
-<w:numbering xmlns:wpc="http://schemas.microsoft.com/office/word/2010/wordprocessingCanvas" xmlns:cx="http://schemas.microsoft.com/office/drawing/2014/chartex" xmlns:cx1="http://schemas.microsoft.com/office/drawing/2015/9/8/chartex" xmlns:cx2="http://schemas.microsoft.com/office/drawing/2015/10/21/chartex" xmlns:cx3="http://schemas.microsoft.com/office/drawing/2016/5/9/chartex" xmlns:cx4="http://schemas.microsoft.com/office/drawing/2016/5/10/chartex" xmlns:cx5="http://schemas.microsoft.com/office/drawing/2016/5/11/chartex" xmlns:cx6="http://schemas.microsoft.com/office/drawing/2016/5/12/chartex" xmlns:cx7="http://schemas.microsoft.com/office/drawing/2016/5/13/chartex" xmlns:cx8="http://schemas.microsoft.com/office/drawing/2016/5/14/chartex" xmlns:mc="http://schemas.openxmlformats.org/markup-compatibility/2006" xmlns:aink="http://schemas.microsoft.com/office/drawing/2016/ink" xmlns:am3d="http://schemas.microsoft.com/office/drawing/2017/model3d" xmlns:o="urn:schemas-microsoft-com:office:office" xmlns:oel="http://schemas.microsoft.com/office/2019/extlst" xmlns:r="http://schemas.openxmlformats.org/officeDocument/2006/relationships" xmlns:m="http://schemas.openxmlformats.org/officeDocument/2006/math" xmlns:v="urn:schemas-microsoft-com:vml" xmlns:wp14="http://schemas.microsoft.com/office/word/2010/wordprocessingDrawing" xmlns:wp="http://schemas.openxmlformats.org/drawingml/2006/wordprocessingDrawing" xmlns:w10="urn:schemas-microsoft-com:office:word" xmlns:w="http://schemas.openxmlformats.org/wordprocessingml/2006/main" xmlns:w14="http://schemas.microsoft.com/office/word/2010/wordml" xmlns:w15="http://schemas.microsoft.com/office/word/2012/wordml" xmlns:w16cex="http://schemas.microsoft.com/office/word/2018/wordml/cex" xmlns:w16cid="http://schemas.microsoft.com/office/word/2016/wordml/cid" xmlns:w16="http://schemas.microsoft.com/office/word/2018/wordml" xmlns:w16du="http://schemas.microsoft.com/office/word/2023/wordml/word16du" xmlns:w16sdtdh="http://schemas.microsoft.com/office/word/2020/wordml/sdtdatahash" xmlns:w16sdtfl="http://schemas.microsoft.com/office/word/2024/wordml/sdtformatlock" xmlns:w16se="http://schemas.microsoft.com/office/word/2015/wordml/symex" xmlns:wpg="http://schemas.microsoft.com/office/word/2010/wordprocessingGroup" xmlns:wpi="http://schemas.microsoft.com/office/word/2010/wordprocessingInk" xmlns:wne="http://schemas.microsoft.com/office/word/2006/wordml" xmlns:wps="http://schemas.microsoft.com/office/word/2010/wordprocessingShape" mc:Ignorable="w14 w15 w16se w16cid w16 w16cex w16sdtdh w16sdtfl w16du wp14">
+<w:numbering xmlns:wpc="http://schemas.microsoft.com/office/word/2010/wordprocessingCanvas" xmlns:cx="http://schemas.microsoft.com/office/drawing/2014/chartex" xmlns:cx1="http://schemas.microsoft.com/office/drawing/2015/9/8/chartex" xmlns:cx2="http://schemas.microsoft.com/office/drawing/2015/10/21/chartex" xmlns:cx3="http://schemas.microsoft.com/office/drawing/2016/5/9/chartex" xmlns:cx4="http://schemas.microsoft.com/office/drawing/2016/5/10/chartex" xmlns:cx5="http://schemas.microsoft.com/office/drawing/2016/5/11/chartex" xmlns:cx6="http://schemas.microsoft.com/office/drawing/2016/5/12/chartex" xmlns:cx7="http://schemas.microsoft.com/office/drawing/2016/5/13/chartex" xmlns:cx8="http://schemas.microsoft.com/office/drawing/2016/5/14/chartex" xmlns:mc="http://schemas.openxmlformats.org/markup-compatibility/2006" xmlns:aink="http://schemas.microsoft.com/office/drawing/2016/ink" xmlns:am3d="http://schemas.microsoft.com/office/drawing/2017/model3d" xmlns:o="urn:schemas-microsoft-com:office:office" xmlns:oel="http://schemas.microsoft.com/office/2019/extlst" xmlns:r="http://schemas.openxmlformats.org/officeDocument/2006/relationships" xmlns:m="http://schemas.openxmlformats.org/officeDocument/2006/math" xmlns:v="urn:schemas-microsoft-com:vml" xmlns:wp14="http://schemas.microsoft.com/office/word/2010/wordprocessingDrawing" xmlns:wp="http://schemas.openxmlformats.org/drawingml/2006/wordprocessingDrawing" xmlns:w10="urn:schemas-microsoft-com:office:word" xmlns:w="http://schemas.openxmlformats.org/wordprocessingml/2006/main" xmlns:w14="http://schemas.microsoft.com/office/word/2010/wordml" xmlns:w15="http://schemas.microsoft.com/office/word/2012/wordml" xmlns:w16cei="http://schemas.microsoft.com/office/word/2026/wordml/cei" xmlns:w16cex="http://schemas.microsoft.com/office/word/2018/wordml/cex" xmlns:w16cid="http://schemas.microsoft.com/office/word/2016/wordml/cid" xmlns:w16="http://schemas.microsoft.com/office/word/2018/wordml" xmlns:w16du="http://schemas.microsoft.com/office/word/2023/wordml/word16du" xmlns:w16sdtdh="http://schemas.microsoft.com/office/word/2020/wordml/sdtdatahash" xmlns:w16sdtfl="http://schemas.microsoft.com/office/word/2024/wordml/sdtformatlock" xmlns:w16se="http://schemas.microsoft.com/office/word/2015/wordml/symex" xmlns:wpg="http://schemas.microsoft.com/office/word/2010/wordprocessingGroup" xmlns:wpi="http://schemas.microsoft.com/office/word/2010/wordprocessingInk" xmlns:wne="http://schemas.microsoft.com/office/word/2006/wordml" xmlns:wps="http://schemas.microsoft.com/office/word/2010/wordprocessingShape" mc:Ignorable="w14 w15 w16se w16cid w16 w16cex w16sdtdh w16sdtfl w16du wp14">
   <w:abstractNum w:abstractNumId="0" w15:restartNumberingAfterBreak="0">
     <w:nsid w:val="14844126"/>
     <w:multiLevelType w:val="hybridMultilevel"/>

</xml_diff>